<commit_message>
CHG-192 optimiza flujo seguro Local a QA
</commit_message>
<xml_diff>
--- a/docs/qa/guia_pruebas_qa_mvp.docx
+++ b/docs/qa/guia_pruebas_qa_mvp.docx
@@ -302,7 +302,7 @@
         <w:t>Última actualización:</w:t>
       </w:r>
       <w:r>
-        <w:t xml:space="preserve"> 2026-07-26</w:t>
+        <w:t xml:space="preserve"> 2026-08-12</w:t>
       </w:r>
     </w:p>
     <w:p>
@@ -916,7 +916,7 @@
               <w:rPr>
                 <w:sz w:val="17"/>
               </w:rPr>
-              <w:t>HÍBRIDO</w:t>
+              <w:t>REAL QA</w:t>
             </w:r>
           </w:p>
         </w:tc>
@@ -940,7 +940,7 @@
               <w:rPr>
                 <w:sz w:val="17"/>
               </w:rPr>
-              <w:t>Productos/servicios y recetas/versiones son reales. Órdenes, recursos operativos, áreas y maquinaria siguen locales.</w:t>
+              <w:t>Productos/servicios, recetas/versiones, maquinaria, órdenes, etapas y validación observada persisten en Production API; no reserva/consume Inventario.</w:t>
             </w:r>
           </w:p>
         </w:tc>
@@ -988,7 +988,7 @@
               <w:rPr>
                 <w:sz w:val="17"/>
               </w:rPr>
-              <w:t>PROTOTIPO LOCAL</w:t>
+              <w:t>REAL QA</w:t>
             </w:r>
           </w:p>
         </w:tc>
@@ -1011,7 +1011,7 @@
               <w:rPr>
                 <w:sz w:val="17"/>
               </w:rPr>
-              <w:t>UX de almacenes, artículos, movimientos, existencias y kardex.</w:t>
+              <w:t>Almacenes, artículos, movimientos, existencias y Kardex usan Inventory API/Cloud SQL; Reservas no disponible.</w:t>
             </w:r>
           </w:p>
         </w:tc>
@@ -1037,7 +1037,7 @@
               <w:rPr>
                 <w:sz w:val="17"/>
               </w:rPr>
-              <w:t>Ventas</w:t>
+              <w:t>Recursos Humanos</w:t>
             </w:r>
           </w:p>
         </w:tc>
@@ -1061,6 +1061,78 @@
               <w:rPr>
                 <w:sz w:val="17"/>
               </w:rPr>
+              <w:t>REAL QA</w:t>
+            </w:r>
+          </w:p>
+        </w:tc>
+        <w:tc>
+          <w:tcPr>
+            <w:tcW w:type="dxa" w:w="3324"/>
+            <w:vAlign w:val="center"/>
+            <w:tcMar>
+              <w:top w:w="80" w:type="dxa"/>
+              <w:start w:w="100" w:type="dxa"/>
+              <w:bottom w:w="80" w:type="dxa"/>
+              <w:end w:w="100" w:type="dxa"/>
+            </w:tcMar>
+            <w:shd w:fill="F3F3F3"/>
+          </w:tcPr>
+          <w:p>
+            <w:pPr>
+              <w:spacing w:after="40"/>
+            </w:pPr>
+            <w:r>
+              <w:rPr>
+                <w:sz w:val="17"/>
+              </w:rPr>
+              <w:t>Áreas y puestos usan HR API/Cloud SQL; catálogos inicialmente vacíos.</w:t>
+            </w:r>
+          </w:p>
+        </w:tc>
+      </w:tr>
+      <w:tr>
+        <w:tc>
+          <w:tcPr>
+            <w:tcW w:type="dxa" w:w="3324"/>
+            <w:vAlign w:val="center"/>
+            <w:tcMar>
+              <w:top w:w="80" w:type="dxa"/>
+              <w:start w:w="100" w:type="dxa"/>
+              <w:bottom w:w="80" w:type="dxa"/>
+              <w:end w:w="100" w:type="dxa"/>
+            </w:tcMar>
+          </w:tcPr>
+          <w:p>
+            <w:pPr>
+              <w:spacing w:after="40"/>
+            </w:pPr>
+            <w:r>
+              <w:rPr>
+                <w:sz w:val="17"/>
+              </w:rPr>
+              <w:t>Ventas</w:t>
+            </w:r>
+          </w:p>
+        </w:tc>
+        <w:tc>
+          <w:tcPr>
+            <w:tcW w:type="dxa" w:w="3324"/>
+            <w:vAlign w:val="center"/>
+            <w:tcMar>
+              <w:top w:w="80" w:type="dxa"/>
+              <w:start w:w="100" w:type="dxa"/>
+              <w:bottom w:w="80" w:type="dxa"/>
+              <w:end w:w="100" w:type="dxa"/>
+            </w:tcMar>
+          </w:tcPr>
+          <w:p>
+            <w:pPr>
+              <w:spacing w:after="40"/>
+            </w:pPr>
+            <w:r>
+              <w:rPr>
+                <w:sz w:val="17"/>
+              </w:rPr>
               <w:t>PROTOTIPO LOCAL</w:t>
             </w:r>
           </w:p>
@@ -1075,7 +1147,6 @@
               <w:bottom w:w="80" w:type="dxa"/>
               <w:end w:w="100" w:type="dxa"/>
             </w:tcMar>
-            <w:shd w:fill="F3F3F3"/>
           </w:tcPr>
           <w:p>
             <w:pPr>
@@ -1101,6 +1172,7 @@
               <w:bottom w:w="80" w:type="dxa"/>
               <w:end w:w="100" w:type="dxa"/>
             </w:tcMar>
+            <w:shd w:fill="F3F3F3"/>
           </w:tcPr>
           <w:p>
             <w:pPr>
@@ -1124,6 +1196,7 @@
               <w:bottom w:w="80" w:type="dxa"/>
               <w:end w:w="100" w:type="dxa"/>
             </w:tcMar>
+            <w:shd w:fill="F3F3F3"/>
           </w:tcPr>
           <w:p>
             <w:pPr>
@@ -1147,6 +1220,7 @@
               <w:bottom w:w="80" w:type="dxa"/>
               <w:end w:w="100" w:type="dxa"/>
             </w:tcMar>
+            <w:shd w:fill="F3F3F3"/>
           </w:tcPr>
           <w:p>
             <w:pPr>
@@ -2807,6 +2881,223 @@
     </w:p>
     <w:p>
       <w:pPr>
+        <w:pStyle w:val="Heading2"/>
+      </w:pPr>
+      <w:r>
+        <w:t>QA-ADM-07 — Editor matricial de permisos</w:t>
+      </w:r>
+    </w:p>
+    <w:p>
+      <w:r>
+        <w:rPr>
+          <w:b/>
+        </w:rPr>
+        <w:t>Prioridad/tipo:</w:t>
+      </w:r>
+      <w:r>
+        <w:t xml:space="preserve"> P0 · LOCAL antes de promover a QA</w:t>
+      </w:r>
+    </w:p>
+    <w:p>
+      <w:pPr>
+        <w:pStyle w:val="ListNumber"/>
+      </w:pPr>
+      <w:r>
+        <w:t xml:space="preserve">Abrir un rol personalizado y entrar a </w:t>
+      </w:r>
+      <w:r>
+        <w:rPr>
+          <w:b/>
+        </w:rPr>
+        <w:t>Editar permisos</w:t>
+      </w:r>
+      <w:r>
+        <w:t>.</w:t>
+      </w:r>
+    </w:p>
+    <w:p>
+      <w:pPr>
+        <w:pStyle w:val="ListNumber"/>
+      </w:pPr>
+      <w:r>
+        <w:t>Buscar por nombre humano y codigo tecnico en ES y EN.</w:t>
+      </w:r>
+    </w:p>
+    <w:p>
+      <w:pPr>
+        <w:pStyle w:val="ListNumber"/>
+      </w:pPr>
+      <w:r>
+        <w:t>Filtrar por asignados/no asignados/cambios y seleccionar/quitar solo resultados visibles.</w:t>
+      </w:r>
+    </w:p>
+    <w:p>
+      <w:pPr>
+        <w:pStyle w:val="ListNumber"/>
+      </w:pPr>
+      <w:r>
+        <w:t>Confirmar que cambiar filtros o idioma conserva el draft completo.</w:t>
+      </w:r>
+    </w:p>
+    <w:p>
+      <w:pPr>
+        <w:pStyle w:val="ListNumber"/>
+      </w:pPr>
+      <w:r>
+        <w:t>Revisar agregados/retirados y guardar una sola vez.</w:t>
+      </w:r>
+    </w:p>
+    <w:p>
+      <w:pPr>
+        <w:pStyle w:val="ListNumber"/>
+      </w:pPr>
+      <w:r>
+        <w:t>Abrir dos sesiones, guardar en la primera y verificar conflicto de revision en la segunda.</w:t>
+      </w:r>
+    </w:p>
+    <w:p>
+      <w:r>
+        <w:rPr>
+          <w:b/>
+        </w:rPr>
+        <w:t>Esperado:</w:t>
+      </w:r>
+      <w:r>
+        <w:t xml:space="preserve"> sin plantillas ni autoasignaciones; scopes no modificados se conservan; filtros no borran permisos ocultos; conflicto no pierde el draft.</w:t>
+      </w:r>
+    </w:p>
+    <w:p>
+      <w:pPr>
+        <w:pStyle w:val="Heading2"/>
+      </w:pPr>
+      <w:r>
+        <w:t>QA-SEC-03 — Seguridad al delegar permisos</w:t>
+      </w:r>
+    </w:p>
+    <w:p>
+      <w:r>
+        <w:rPr>
+          <w:b/>
+        </w:rPr>
+        <w:t>Prioridad/tipo:</w:t>
+      </w:r>
+      <w:r>
+        <w:t xml:space="preserve"> P0 · AUTOMATICA y REAL QA autorizado</w:t>
+      </w:r>
+    </w:p>
+    <w:p>
+      <w:pPr>
+        <w:pStyle w:val="ListBullet"/>
+      </w:pPr>
+      <w:r>
+        <w:t xml:space="preserve">Sin token, tenant o </w:t>
+      </w:r>
+      <w:r>
+        <w:rPr>
+          <w:rFonts w:ascii="Consolas" w:hAnsi="Consolas"/>
+          <w:color w:val="351455"/>
+          <w:sz w:val="18"/>
+        </w:rPr>
+        <w:t>admin.role.read</w:t>
+      </w:r>
+      <w:r>
+        <w:t>, el catalogo se rechaza.</w:t>
+      </w:r>
+    </w:p>
+    <w:p>
+      <w:pPr>
+        <w:pStyle w:val="ListBullet"/>
+      </w:pPr>
+      <w:r>
+        <w:t xml:space="preserve">Un rol tenant no puede recibir </w:t>
+      </w:r>
+      <w:r>
+        <w:rPr>
+          <w:rFonts w:ascii="Consolas" w:hAnsi="Consolas"/>
+          <w:color w:val="351455"/>
+          <w:sz w:val="18"/>
+        </w:rPr>
+        <w:t>internal.*</w:t>
+      </w:r>
+      <w:r>
+        <w:t xml:space="preserve">, </w:t>
+      </w:r>
+      <w:r>
+        <w:rPr>
+          <w:rFonts w:ascii="Consolas" w:hAnsi="Consolas"/>
+          <w:color w:val="351455"/>
+          <w:sz w:val="18"/>
+        </w:rPr>
+        <w:t>public.*</w:t>
+      </w:r>
+      <w:r>
+        <w:t xml:space="preserve">, </w:t>
+      </w:r>
+      <w:r>
+        <w:rPr>
+          <w:rFonts w:ascii="Consolas" w:hAnsi="Consolas"/>
+          <w:color w:val="351455"/>
+          <w:sz w:val="18"/>
+        </w:rPr>
+        <w:t>external.*</w:t>
+      </w:r>
+      <w:r>
+        <w:t xml:space="preserve"> ni permisos no asignables.</w:t>
+      </w:r>
+    </w:p>
+    <w:p>
+      <w:pPr>
+        <w:pStyle w:val="ListBullet"/>
+      </w:pPr>
+      <w:r>
+        <w:t>No se pueden agregar permisos de modulos inactivos/suspendidos; asignaciones historicas se conservan sin ser efectivas.</w:t>
+      </w:r>
+    </w:p>
+    <w:p>
+      <w:pPr>
+        <w:pStyle w:val="ListBullet"/>
+      </w:pPr>
+      <w:r>
+        <w:t>Mezclar un ID valido y uno prohibido rechaza todo sin cambios.</w:t>
+      </w:r>
+    </w:p>
+    <w:p>
+      <w:pPr>
+        <w:pStyle w:val="ListBullet"/>
+      </w:pPr>
+      <w:r>
+        <w:rPr>
+          <w:rFonts w:ascii="Consolas" w:hAnsi="Consolas"/>
+          <w:color w:val="351455"/>
+          <w:sz w:val="18"/>
+        </w:rPr>
+        <w:t>admin.role.update</w:t>
+      </w:r>
+      <w:r>
+        <w:t xml:space="preserve"> sin </w:t>
+      </w:r>
+      <w:r>
+        <w:rPr>
+          <w:rFonts w:ascii="Consolas" w:hAnsi="Consolas"/>
+          <w:color w:val="351455"/>
+          <w:sz w:val="18"/>
+        </w:rPr>
+        <w:t>admin.role.permissions.manage</w:t>
+      </w:r>
+      <w:r>
+        <w:t xml:space="preserve"> no permite modificar grants.</w:t>
+      </w:r>
+    </w:p>
+    <w:p>
+      <w:pPr>
+        <w:pStyle w:val="ListBullet"/>
+      </w:pPr>
+      <w:r>
+        <w:t>Reintento con misma clave/payload reproduce resultado; misma clave con otro payload devuelve conflicto.</w:t>
+      </w:r>
+    </w:p>
+    <w:p>
+      <w:pPr>
         <w:pStyle w:val="Heading1"/>
       </w:pPr>
       <w:r>
@@ -2821,7 +3112,7 @@
         <w:t>Contexto del módulo:</w:t>
       </w:r>
       <w:r>
-        <w:t xml:space="preserve"> define qué producto o servicio ofrece la empresa y estandariza recursos y etapas mediante recetas versionadas. Hoy son reales únicamente Productos y servicios y Recetas.</w:t>
+        <w:t xml:space="preserve"> define productos/servicios, recetas versionadas, maquinaria y órdenes persistidas. La validación de disponibilidad es una fotografía observada; no reserva ni consume Inventario.</w:t>
       </w:r>
     </w:p>
     <w:p>
@@ -3213,7 +3504,7 @@
         <w:pStyle w:val="Heading2"/>
       </w:pPr>
       <w:r>
-        <w:t>QA-PROD-06 — Funciones locales de Producción</w:t>
+        <w:t>QA-PROD-06 — Órdenes, etapas, maquinaria e integración de catálogos</w:t>
       </w:r>
     </w:p>
     <w:p>
@@ -3224,12 +3515,310 @@
         <w:t>Prioridad/tipo:</w:t>
       </w:r>
       <w:r>
-        <w:t xml:space="preserve"> P1 · PROTOTIPO LOCAL</w:t>
-      </w:r>
-    </w:p>
-    <w:p>
-      <w:r>
-        <w:t>Recorrer Órdenes, Entregables, Validación de recursos, Áreas y puestos y Maquinaria. Evaluar formularios, cálculos, estados, impresión y claridad del flujo.</w:t>
+        <w:t xml:space="preserve"> P0 · REAL QA</w:t>
+      </w:r>
+    </w:p>
+    <w:p>
+      <w:r>
+        <w:t>Crear una orden desde una receta aprobada vigente, recargar, ejecutar transiciones válidas de etapas y cerrar explícitamente. Validar maquinaria contra áreas RH y recursos de receta contra artículos Inventory/RH reales.</w:t>
+      </w:r>
+    </w:p>
+    <w:p>
+      <w:r>
+        <w:t xml:space="preserve">Para </w:t>
+      </w:r>
+      <w:r>
+        <w:rPr>
+          <w:b/>
+        </w:rPr>
+        <w:t>Áreas y puestos</w:t>
+      </w:r>
+      <w:r>
+        <w:t xml:space="preserve"> validar además:</w:t>
+      </w:r>
+    </w:p>
+    <w:p>
+      <w:pPr>
+        <w:pStyle w:val="ListBullet"/>
+      </w:pPr>
+      <w:r>
+        <w:t>[ ] Nueva área solicita únicamente código, nombre, descripción y estatus; no crea puestos.</w:t>
+      </w:r>
+    </w:p>
+    <w:p>
+      <w:pPr>
+        <w:pStyle w:val="ListBullet"/>
+      </w:pPr>
+      <w:r>
+        <w:t>[ ] Nuevo puesto muestra un selector y no permite escribir un área libremente.</w:t>
+      </w:r>
+    </w:p>
+    <w:p>
+      <w:pPr>
+        <w:pStyle w:val="ListBullet"/>
+      </w:pPr>
+      <w:r>
+        <w:t xml:space="preserve">[ ] No puede guardarse un puesto si su </w:t>
+      </w:r>
+      <w:r>
+        <w:rPr>
+          <w:rFonts w:ascii="Consolas" w:hAnsi="Consolas"/>
+          <w:color w:val="351455"/>
+          <w:sz w:val="18"/>
+        </w:rPr>
+        <w:t>area_id</w:t>
+      </w:r>
+      <w:r>
+        <w:t xml:space="preserve"> no existe o pertenece a otro tenant.</w:t>
+      </w:r>
+    </w:p>
+    <w:p>
+      <w:pPr>
+        <w:pStyle w:val="ListBullet"/>
+      </w:pPr>
+      <w:r>
+        <w:t>[ ] Código y nombre de área no se duplican ignorando mayúsculas/minúsculas.</w:t>
+      </w:r>
+    </w:p>
+    <w:p>
+      <w:pPr>
+        <w:pStyle w:val="ListBullet"/>
+      </w:pPr>
+      <w:r>
+        <w:t>[ ] Renombrar un área conserva sus puestos vinculados por ID.</w:t>
+      </w:r>
+    </w:p>
+    <w:p>
+      <w:pPr>
+        <w:pStyle w:val="ListBullet"/>
+      </w:pPr>
+      <w:r>
+        <w:t>[ ] Editar un puesto actualiza cantidad de recursos, minutos, capacidad total, costo y estatus sin crear otra área.</w:t>
+      </w:r>
+    </w:p>
+    <w:p>
+      <w:pPr>
+        <w:pStyle w:val="ListBullet"/>
+      </w:pPr>
+      <w:r>
+        <w:t xml:space="preserve">[ ] Un rol con </w:t>
+      </w:r>
+      <w:r>
+        <w:rPr>
+          <w:rFonts w:ascii="Consolas" w:hAnsi="Consolas"/>
+          <w:color w:val="351455"/>
+          <w:sz w:val="18"/>
+        </w:rPr>
+        <w:t>hr.area.update</w:t>
+      </w:r>
+      <w:r>
+        <w:t xml:space="preserve"> puede editar áreas sin obtener </w:t>
+      </w:r>
+      <w:r>
+        <w:rPr>
+          <w:rFonts w:ascii="Consolas" w:hAnsi="Consolas"/>
+          <w:color w:val="351455"/>
+          <w:sz w:val="18"/>
+        </w:rPr>
+        <w:t>hr.position.update</w:t>
+      </w:r>
+      <w:r>
+        <w:t>, y viceversa.</w:t>
+      </w:r>
+    </w:p>
+    <w:p>
+      <w:pPr>
+        <w:pStyle w:val="ListBullet"/>
+      </w:pPr>
+      <w:r>
+        <w:t>[ ] Areas y puestos aparece dentro de Recursos Humanos y ya no en la navegacion de Produccion.</w:t>
+      </w:r>
+    </w:p>
+    <w:p>
+      <w:pPr>
+        <w:pStyle w:val="ListBullet"/>
+      </w:pPr>
+      <w:r>
+        <w:t xml:space="preserve">[ ] Sin entitlement </w:t>
+      </w:r>
+      <w:r>
+        <w:rPr>
+          <w:rFonts w:ascii="Consolas" w:hAnsi="Consolas"/>
+          <w:color w:val="351455"/>
+          <w:sz w:val="18"/>
+        </w:rPr>
+        <w:t>hr</w:t>
+      </w:r>
+      <w:r>
+        <w:t xml:space="preserve"> activo, la navegacion se oculta y </w:t>
+      </w:r>
+      <w:r>
+        <w:rPr>
+          <w:rFonts w:ascii="Consolas" w:hAnsi="Consolas"/>
+          <w:color w:val="351455"/>
+          <w:sz w:val="18"/>
+        </w:rPr>
+        <w:t>hr-service</w:t>
+      </w:r>
+      <w:r>
+        <w:t xml:space="preserve"> rechaza la llamada directa.</w:t>
+      </w:r>
+    </w:p>
+    <w:p>
+      <w:pPr>
+        <w:pStyle w:val="ListBullet"/>
+      </w:pPr>
+      <w:r>
+        <w:t>[ ] Un puesto no puede vincularse a un area inexistente, inactiva o de otro tenant.</w:t>
+      </w:r>
+    </w:p>
+    <w:p>
+      <w:pPr>
+        <w:pStyle w:val="ListBullet"/>
+      </w:pPr>
+      <w:r>
+        <w:t xml:space="preserve">[ ] Repetir una mutacion con la misma </w:t>
+      </w:r>
+      <w:r>
+        <w:rPr>
+          <w:rFonts w:ascii="Consolas" w:hAnsi="Consolas"/>
+          <w:color w:val="351455"/>
+          <w:sz w:val="18"/>
+        </w:rPr>
+        <w:t>Idempotency-Key</w:t>
+      </w:r>
+      <w:r>
+        <w:t xml:space="preserve"> no duplica datos; cambiar el payload con esa clave devuelve conflicto.</w:t>
+      </w:r>
+    </w:p>
+    <w:p>
+      <w:pPr>
+        <w:pStyle w:val="ListBullet"/>
+      </w:pPr>
+      <w:r>
+        <w:t xml:space="preserve">[ ] El catalogo de Permisos muestra una seccion Recursos Humanos con exactamente seis permisos </w:t>
+      </w:r>
+      <w:r>
+        <w:rPr>
+          <w:rFonts w:ascii="Consolas" w:hAnsi="Consolas"/>
+          <w:color w:val="351455"/>
+          <w:sz w:val="18"/>
+        </w:rPr>
+        <w:t>hr.area.*</w:t>
+      </w:r>
+      <w:r>
+        <w:t xml:space="preserve"> y </w:t>
+      </w:r>
+      <w:r>
+        <w:rPr>
+          <w:rFonts w:ascii="Consolas" w:hAnsi="Consolas"/>
+          <w:color w:val="351455"/>
+          <w:sz w:val="18"/>
+        </w:rPr>
+        <w:t>hr.position.*</w:t>
+      </w:r>
+      <w:r>
+        <w:t>.</w:t>
+      </w:r>
+    </w:p>
+    <w:p>
+      <w:pPr>
+        <w:pStyle w:val="ListBullet"/>
+      </w:pPr>
+      <w:r>
+        <w:t xml:space="preserve">[ ] El selector de permisos de cada rol agrupa RH por separado y no ofrece codigos heredados con prefijo </w:t>
+      </w:r>
+      <w:r>
+        <w:rPr>
+          <w:rFonts w:ascii="Consolas" w:hAnsi="Consolas"/>
+          <w:color w:val="351455"/>
+          <w:sz w:val="18"/>
+        </w:rPr>
+        <w:t>production.labor</w:t>
+      </w:r>
+      <w:r>
+        <w:t>.</w:t>
+      </w:r>
+    </w:p>
+    <w:p>
+      <w:pPr>
+        <w:pStyle w:val="ListBullet"/>
+      </w:pPr>
+      <w:r>
+        <w:t xml:space="preserve">[ ] Tras ejecutar el seed autorizado, </w:t>
+      </w:r>
+      <w:r>
+        <w:rPr>
+          <w:rFonts w:ascii="Consolas" w:hAnsi="Consolas"/>
+          <w:color w:val="351455"/>
+          <w:sz w:val="18"/>
+        </w:rPr>
+        <w:t>production.labor.*</w:t>
+      </w:r>
+      <w:r>
+        <w:t xml:space="preserve">, </w:t>
+      </w:r>
+      <w:r>
+        <w:rPr>
+          <w:rFonts w:ascii="Consolas" w:hAnsi="Consolas"/>
+          <w:color w:val="351455"/>
+          <w:sz w:val="18"/>
+        </w:rPr>
+        <w:t>production.labor_area.*</w:t>
+      </w:r>
+      <w:r>
+        <w:t xml:space="preserve"> y </w:t>
+      </w:r>
+      <w:r>
+        <w:rPr>
+          <w:rFonts w:ascii="Consolas" w:hAnsi="Consolas"/>
+          <w:color w:val="351455"/>
+          <w:sz w:val="18"/>
+        </w:rPr>
+        <w:t>production.labor_role.*</w:t>
+      </w:r>
+      <w:r>
+        <w:t xml:space="preserve"> quedan inactivos y no forman parte de permisos efectivos.</w:t>
+      </w:r>
+    </w:p>
+    <w:p>
+      <w:pPr>
+        <w:pStyle w:val="ListBullet"/>
+      </w:pPr>
+      <w:r>
+        <w:t>[ ] El puesto captura costo por hora e indica si interviene en produccion.</w:t>
+      </w:r>
+    </w:p>
+    <w:p>
+      <w:pPr>
+        <w:pStyle w:val="ListBullet"/>
+      </w:pPr>
+      <w:r>
+        <w:t>[ ] Solo puestos activos marcados para produccion aparecen como recursos de receta.</w:t>
+      </w:r>
+    </w:p>
+    <w:p>
+      <w:pPr>
+        <w:pStyle w:val="ListBullet"/>
+      </w:pPr>
+      <w:r>
+        <w:t>[ ] Un articulo sin movimientos y con almacen sugerido aparece en Inventario con saldo cero.</w:t>
+      </w:r>
+    </w:p>
+    <w:p>
+      <w:pPr>
+        <w:pStyle w:val="ListBullet"/>
+      </w:pPr>
+      <w:r>
+        <w:t>[ ] Solo articulos activos con Usar en receta aparecen en el selector de recursos; su disponibilidad suma almacenes del tenant.</w:t>
+      </w:r>
+    </w:p>
+    <w:p>
+      <w:pPr>
+        <w:pStyle w:val="ListBullet"/>
+      </w:pPr>
+      <w:r>
+        <w:t>[ ] Alta de área, alta de puesto, edición de área y edición de puesto producen auditoría e idempotencia backend.</w:t>
       </w:r>
     </w:p>
     <w:p>
@@ -3240,7 +3829,7 @@
         <w:t>Esperado:</w:t>
       </w:r>
       <w:r>
-        <w:t xml:space="preserve"> experiencia coherente en el mismo navegador. No exigir sincronización entre dispositivos ni persistencia PostgreSQL.</w:t>
+        <w:t xml:space="preserve"> persistencia PostgreSQL entre recargas/sesiones, transiciones backend válidas y ningún fallback a datos simulados.</w:t>
       </w:r>
     </w:p>
     <w:p>
@@ -3251,7 +3840,7 @@
         <w:t>Por qué:</w:t>
       </w:r>
       <w:r>
-        <w:t xml:space="preserve"> permite validar tempranamente el proceso antes de conectar el backend.</w:t>
+        <w:t xml:space="preserve"> certifica el flujo real promovido sin confundir disponibilidad observada con reservas.</w:t>
       </w:r>
     </w:p>
     <w:p>
@@ -3281,7 +3870,7 @@
         <w:t>Estado:</w:t>
       </w:r>
       <w:r>
-        <w:t xml:space="preserve"> PROTOTIPO LOCAL.</w:t>
+        <w:t xml:space="preserve"> REAL QA, excepto Reservas.</w:t>
       </w:r>
     </w:p>
     <w:tbl>
@@ -3449,7 +4038,7 @@
               <w:rPr>
                 <w:sz w:val="17"/>
               </w:rPr>
-              <w:t>P1</w:t>
+              <w:t>P0</w:t>
             </w:r>
           </w:p>
         </w:tc>
@@ -3472,7 +4061,7 @@
               <w:rPr>
                 <w:sz w:val="17"/>
               </w:rPr>
-              <w:t>Crear, buscar y editar almacén.</w:t>
+              <w:t>Crear, buscar y editar almacén; recargar/abrir otra sesión.</w:t>
             </w:r>
           </w:p>
         </w:tc>
@@ -3495,7 +4084,7 @@
               <w:rPr>
                 <w:sz w:val="17"/>
               </w:rPr>
-              <w:t>Validaciones y datos coherentes en el navegador actual.</w:t>
+              <w:t>Persiste en Inventory API sin datos simulados.</w:t>
             </w:r>
           </w:p>
         </w:tc>
@@ -3545,7 +4134,7 @@
               <w:rPr>
                 <w:sz w:val="17"/>
               </w:rPr>
-              <w:t>P1</w:t>
+              <w:t>P0</w:t>
             </w:r>
           </w:p>
         </w:tc>
@@ -3569,7 +4158,7 @@
               <w:rPr>
                 <w:sz w:val="17"/>
               </w:rPr>
-              <w:t>Crear artículo con SKU, tipo y unidad.</w:t>
+              <w:t>Crear artículo con SKU, tipo y unidad; recargar.</w:t>
             </w:r>
           </w:p>
         </w:tc>
@@ -3593,7 +4182,7 @@
               <w:rPr>
                 <w:sz w:val="17"/>
               </w:rPr>
-              <w:t>Registro seleccionable y sin duplicados evidentes.</w:t>
+              <w:t>Registro persistido, seleccionable y sin duplicados.</w:t>
             </w:r>
           </w:p>
         </w:tc>
@@ -3641,7 +4230,7 @@
               <w:rPr>
                 <w:sz w:val="17"/>
               </w:rPr>
-              <w:t>P1</w:t>
+              <w:t>P0</w:t>
             </w:r>
           </w:p>
         </w:tc>
@@ -3687,7 +4276,7 @@
               <w:rPr>
                 <w:sz w:val="17"/>
               </w:rPr>
-              <w:t>Existencia y kardex cambian conforme al movimiento.</w:t>
+              <w:t>Movimiento PostgreSQL, existencia y Kardex coherentes tras recarga.</w:t>
             </w:r>
           </w:p>
         </w:tc>
@@ -3986,7 +4575,58 @@
     <w:p/>
     <w:p>
       <w:r>
-        <w:t>No certificar todavía concurrencia, lotes, series, reservas reales ni integración con Producción.</w:t>
+        <w:t>No certificar todavía lotes, series, reservas reales ni consumo automático desde Producción.</w:t>
+      </w:r>
+    </w:p>
+    <w:p>
+      <w:pPr>
+        <w:pStyle w:val="Heading1"/>
+      </w:pPr>
+      <w:r>
+        <w:t>9.1 Recursos Humanos</w:t>
+      </w:r>
+    </w:p>
+    <w:p>
+      <w:r>
+        <w:rPr>
+          <w:b/>
+        </w:rPr>
+        <w:t>Estado:</w:t>
+      </w:r>
+      <w:r>
+        <w:t xml:space="preserve"> REAL QA.</w:t>
+      </w:r>
+    </w:p>
+    <w:p>
+      <w:pPr>
+        <w:pStyle w:val="ListBullet"/>
+      </w:pPr>
+      <w:r>
+        <w:t>Crear área y puesto con permisos separados; recargar y verificar persistencia.</w:t>
+      </w:r>
+    </w:p>
+    <w:p>
+      <w:pPr>
+        <w:pStyle w:val="ListBullet"/>
+      </w:pPr>
+      <w:r>
+        <w:t>Rechazar área inexistente/inactiva/de otro tenant e idempotencia conflictiva.</w:t>
+      </w:r>
+    </w:p>
+    <w:p>
+      <w:pPr>
+        <w:pStyle w:val="ListBullet"/>
+      </w:pPr>
+      <w:r>
+        <w:t>Confirmar que puestos productivos alimentan Recetas y que Maquinaria selecciona áreas activas.</w:t>
+      </w:r>
+    </w:p>
+    <w:p>
+      <w:pPr>
+        <w:pStyle w:val="ListBullet"/>
+      </w:pPr>
+      <w:r>
+        <w:t>Un catálogo vacío debe mostrarse vacío, sin ejemplos ni conteos simulados.</w:t>
       </w:r>
     </w:p>
     <w:p>
@@ -6098,6 +6738,464 @@
         <w:t>se guardó evidencia de ambiente, build y dispositivo.</w:t>
       </w:r>
     </w:p>
+    <w:p>
+      <w:pPr>
+        <w:pStyle w:val="Heading1"/>
+      </w:pPr>
+      <w:r>
+        <w:t>16. Validacion local previa de volumen de Inventario</w:t>
+      </w:r>
+    </w:p>
+    <w:p>
+      <w:r>
+        <w:t xml:space="preserve">El nombre visible objetivo del modulo es </w:t>
+      </w:r>
+      <w:r>
+        <w:rPr>
+          <w:b/>
+        </w:rPr>
+        <w:t>Inventario</w:t>
+      </w:r>
+      <w:r>
+        <w:t xml:space="preserve">, conservando </w:t>
+      </w:r>
+      <w:r>
+        <w:rPr>
+          <w:rFonts w:ascii="Consolas" w:hAnsi="Consolas"/>
+          <w:color w:val="351455"/>
+          <w:sz w:val="18"/>
+        </w:rPr>
+        <w:t>existencias</w:t>
+      </w:r>
+      <w:r>
+        <w:t xml:space="preserve"> como identificador tecnico de la consulta. Esta decision documental no cambia por si sola el alcance desplegado ni autoriza pruebas sobre QA.</w:t>
+      </w:r>
+    </w:p>
+    <w:p>
+      <w:r>
+        <w:t>Antes de conectar busqueda, filtros y paginacion server-side, ejecutar localmente:</w:t>
+      </w:r>
+    </w:p>
+    <w:p>
+      <w:pPr>
+        <w:pStyle w:val="QANote"/>
+      </w:pPr>
+      <w:r>
+        <w:rPr>
+          <w:rFonts w:ascii="Consolas" w:hAnsi="Consolas"/>
+          <w:sz w:val="18"/>
+        </w:rPr>
+        <w:t>node tools/benchmarks/inventory-volume.js</w:t>
+      </w:r>
+    </w:p>
+    <w:p>
+      <w:r>
+        <w:t xml:space="preserve">El guardrail usa 10,000 articulos sinteticos por tenant y no requiere red ni credenciales. Debe pasar busqueda parcial, filtros combinados, aislamiento, paginacion sin duplicados y la regla temporal </w:t>
+      </w:r>
+      <w:r>
+        <w:rPr>
+          <w:rFonts w:ascii="Consolas" w:hAnsi="Consolas"/>
+          <w:color w:val="351455"/>
+          <w:sz w:val="18"/>
+        </w:rPr>
+        <w:t>available_quantity = on_hand_quantity</w:t>
+      </w:r>
+      <w:r>
+        <w:t xml:space="preserve"> mientras Reservas no exista.</w:t>
+      </w:r>
+    </w:p>
+    <w:p>
+      <w:r>
+        <w:t>No ejecutar nuevas cargas de volumen, seeds, migraciones ni benchmarks en Cloud SQL QA sin autorizacion explicita. Cada promocion autorizada debe agregar casos QA separados para el API real y actualizar el mapa de alcance; el benchmark sintetico de 10,000 articulos permanece exclusivamente local.</w:t>
+      </w:r>
+    </w:p>
+    <w:p>
+      <w:pPr>
+        <w:pStyle w:val="Heading2"/>
+      </w:pPr>
+      <w:r>
+        <w:t>Promocion autorizada del 2026-07-31</w:t>
+      </w:r>
+    </w:p>
+    <w:p>
+      <w:r>
+        <w:t xml:space="preserve">La autorizacion cubrio las migraciones acumuladas hasta </w:t>
+      </w:r>
+      <w:r>
+        <w:rPr>
+          <w:rFonts w:ascii="Consolas" w:hAnsi="Consolas"/>
+          <w:color w:val="351455"/>
+          <w:sz w:val="18"/>
+        </w:rPr>
+        <w:t>20260730_0011</w:t>
+      </w:r>
+      <w:r>
+        <w:t xml:space="preserve">, el seed administrativo idempotente y el reinicio de la Admin API local conectada a QA. Antes de migrar se genero el respaldo </w:t>
+      </w:r>
+      <w:r>
+        <w:rPr>
+          <w:rFonts w:ascii="Consolas" w:hAnsi="Consolas"/>
+          <w:color w:val="351455"/>
+          <w:sz w:val="18"/>
+        </w:rPr>
+        <w:t>C:\tmp\erclave_qa_pre_permission_20260731_093634.dump</w:t>
+      </w:r>
+      <w:r>
+        <w:t xml:space="preserve"> y se valido su indice con </w:t>
+      </w:r>
+      <w:r>
+        <w:rPr>
+          <w:rFonts w:ascii="Consolas" w:hAnsi="Consolas"/>
+          <w:color w:val="351455"/>
+          <w:sz w:val="18"/>
+        </w:rPr>
+        <w:t>pg_restore --list</w:t>
+      </w:r>
+      <w:r>
+        <w:t>.</w:t>
+      </w:r>
+    </w:p>
+    <w:p>
+      <w:r>
+        <w:t xml:space="preserve">Las postcondiciones obligatorias quedaron aprobadas: tenant ERClave Demo QA y modulo admin activos, 99 permisos activos sin codigos duplicados, el owner objetivo con </w:t>
+      </w:r>
+      <w:r>
+        <w:rPr>
+          <w:rFonts w:ascii="Consolas" w:hAnsi="Consolas"/>
+          <w:color w:val="351455"/>
+          <w:sz w:val="18"/>
+        </w:rPr>
+        <w:t>admin.role.permissions.manage</w:t>
+      </w:r>
+      <w:r>
+        <w:t>, ningun owner del sistema por debajo del piso administrativo y cero registros en almacenes, articulos, movimientos, areas y puestos. No se autorizo ni ejecuto carga dummy, benchmark remoto, despliegue o activacion adicional de modulos.</w:t>
+      </w:r>
+    </w:p>
+    <w:p>
+      <w:r>
+        <w:t xml:space="preserve">Para la prueba funcional del editor, renovar primero la sesion del navegador con recarga forzada o </w:t>
+      </w:r>
+      <w:r>
+        <w:rPr>
+          <w:rFonts w:ascii="Consolas" w:hAnsi="Consolas"/>
+          <w:color w:val="351455"/>
+          <w:sz w:val="18"/>
+        </w:rPr>
+        <w:t>Actualizar</w:t>
+      </w:r>
+      <w:r>
+        <w:t xml:space="preserve">; despues verificar que </w:t>
+      </w:r>
+      <w:r>
+        <w:rPr>
+          <w:rFonts w:ascii="Consolas" w:hAnsi="Consolas"/>
+          <w:color w:val="351455"/>
+          <w:sz w:val="18"/>
+        </w:rPr>
+        <w:t>Ver permisos</w:t>
+      </w:r>
+      <w:r>
+        <w:t xml:space="preserve"> cambie a </w:t>
+      </w:r>
+      <w:r>
+        <w:rPr>
+          <w:rFonts w:ascii="Consolas" w:hAnsi="Consolas"/>
+          <w:color w:val="351455"/>
+          <w:sz w:val="18"/>
+        </w:rPr>
+        <w:t>Editar permisos</w:t>
+      </w:r>
+      <w:r>
+        <w:t>, que el guardado requiera cambios pendientes y que una recarga conserve las asignaciones.</w:t>
+      </w:r>
+    </w:p>
+    <w:p>
+      <w:pPr>
+        <w:pStyle w:val="Heading1"/>
+      </w:pPr>
+      <w:r>
+        <w:t>17. Checklist responsive transversal</w:t>
+      </w:r>
+    </w:p>
+    <w:p>
+      <w:r>
+        <w:t xml:space="preserve">Aplicar este checklist a toda pantalla nueva o modificada. La fuente tecnica es </w:t>
+      </w:r>
+      <w:r>
+        <w:rPr>
+          <w:rFonts w:ascii="Consolas" w:hAnsi="Consolas"/>
+          <w:color w:val="351455"/>
+          <w:sz w:val="18"/>
+        </w:rPr>
+        <w:t>docs/arquitectura/estandar_responsive_transversal.md</w:t>
+      </w:r>
+      <w:r>
+        <w:t>.</w:t>
+      </w:r>
+    </w:p>
+    <w:p>
+      <w:pPr>
+        <w:pStyle w:val="Heading2"/>
+      </w:pPr>
+      <w:r>
+        <w:t>Matriz minima</w:t>
+      </w:r>
+    </w:p>
+    <w:p>
+      <w:r>
+        <w:t>Probar 1,440 x 900, 1,280 x 720, 1,024 x 768, 768 x 1,024, 390 x 844 y 320 x 568. En escritorio repetir a zoom 200%. Si hay tabla operativa movil, probar tambien orientacion horizontal.</w:t>
+      </w:r>
+    </w:p>
+    <w:p>
+      <w:r>
+        <w:t>No basta cambiar el viewport: reducir el ancho real del panel abriendo sidebar, guia de flujo, alertas u otro panel lateral. Repetir estados amplio, intermedio y estrecho con Espanol e Ingles.</w:t>
+      </w:r>
+    </w:p>
+    <w:p>
+      <w:pPr>
+        <w:pStyle w:val="Heading2"/>
+      </w:pPr>
+      <w:r>
+        <w:t>QA-RESP-02 - Contenedor y estructura</w:t>
+      </w:r>
+    </w:p>
+    <w:p>
+      <w:pPr>
+        <w:pStyle w:val="ListBullet"/>
+      </w:pPr>
+      <w:r>
+        <w:t>[ ] El componente cambia por su ancho de contenedor, no solamente por el viewport.</w:t>
+      </w:r>
+    </w:p>
+    <w:p>
+      <w:pPr>
+        <w:pStyle w:val="ListBullet"/>
+      </w:pPr>
+      <w:r>
+        <w:t>[ ] No hay scroll horizontal de pagina, superposiciones ni regiones fuera de pantalla.</w:t>
+      </w:r>
+    </w:p>
+    <w:p>
+      <w:pPr>
+        <w:pStyle w:val="ListBullet"/>
+      </w:pPr>
+      <w:r>
+        <w:t>[ ] Sidebar, flujo y alertas pueden coexistir sin comprimir el area operativa hasta hacerla inutilizable.</w:t>
+      </w:r>
+    </w:p>
+    <w:p>
+      <w:pPr>
+        <w:pStyle w:val="ListBullet"/>
+      </w:pPr>
+      <w:r>
+        <w:t>[ ] Carga, vacio, error, sin permisos y resultados reales conservan la misma calidad responsive.</w:t>
+      </w:r>
+    </w:p>
+    <w:p>
+      <w:pPr>
+        <w:pStyle w:val="Heading2"/>
+      </w:pPr>
+      <w:r>
+        <w:t>QA-RESP-03 - Tablas y colecciones</w:t>
+      </w:r>
+    </w:p>
+    <w:p>
+      <w:pPr>
+        <w:pStyle w:val="ListBullet"/>
+      </w:pPr>
+      <w:r>
+        <w:t>[ ] La tabla usa tarjeta, scroll interno o vista reducida de acuerdo con la estrategia documentada.</w:t>
+      </w:r>
+    </w:p>
+    <w:p>
+      <w:pPr>
+        <w:pStyle w:val="ListBullet"/>
+      </w:pPr>
+      <w:r>
+        <w:t>[ ] En tarjetas cada valor conserva etiqueta, unidad, estado y accion; no depende de encabezados ocultos.</w:t>
+      </w:r>
+    </w:p>
+    <w:p>
+      <w:pPr>
+        <w:pStyle w:val="ListBullet"/>
+      </w:pPr>
+      <w:r>
+        <w:t>[ ] Si existe scroll, queda dentro de la tabla, es perceptible y no oculta acciones esenciales.</w:t>
+      </w:r>
+    </w:p>
+    <w:p>
+      <w:pPr>
+        <w:pStyle w:val="ListBullet"/>
+      </w:pPr>
+      <w:r>
+        <w:t>[ ] Identificadores, cantidades y acciones no se cortan ni se solapan.</w:t>
+      </w:r>
+    </w:p>
+    <w:p>
+      <w:pPr>
+        <w:pStyle w:val="ListBullet"/>
+      </w:pPr>
+      <w:r>
+        <w:t>[ ] El orden de lectura y tabulacion sigue siendo logico.</w:t>
+      </w:r>
+    </w:p>
+    <w:p>
+      <w:pPr>
+        <w:pStyle w:val="Heading2"/>
+      </w:pPr>
+      <w:r>
+        <w:t>QA-RESP-04 - Texto y localizacion</w:t>
+      </w:r>
+    </w:p>
+    <w:p>
+      <w:pPr>
+        <w:pStyle w:val="ListBullet"/>
+      </w:pPr>
+      <w:r>
+        <w:t>[ ] Titulos, breadcrumbs, chips, botones, alertas y ayudas soportan textos ES/EN largos.</w:t>
+      </w:r>
+    </w:p>
+    <w:p>
+      <w:pPr>
+        <w:pStyle w:val="ListBullet"/>
+      </w:pPr>
+      <w:r>
+        <w:t>[ ] Correos, URLs, IDs y correlation IDs envuelven o permiten consultar/copiar el valor completo.</w:t>
+      </w:r>
+    </w:p>
+    <w:p>
+      <w:pPr>
+        <w:pStyle w:val="ListBullet"/>
+      </w:pPr>
+      <w:r>
+        <w:t>[ ] No hay alturas fijas que corten traducciones o mensajes de validacion.</w:t>
+      </w:r>
+    </w:p>
+    <w:p>
+      <w:pPr>
+        <w:pStyle w:val="ListBullet"/>
+      </w:pPr>
+      <w:r>
+        <w:t>[ ] La elipsis, si existe, ofrece acceso al contenido completo.</w:t>
+      </w:r>
+    </w:p>
+    <w:p>
+      <w:pPr>
+        <w:pStyle w:val="Heading2"/>
+      </w:pPr>
+      <w:r>
+        <w:t>QA-RESP-05 - Formularios y acciones</w:t>
+      </w:r>
+    </w:p>
+    <w:p>
+      <w:pPr>
+        <w:pStyle w:val="ListBullet"/>
+      </w:pPr>
+      <w:r>
+        <w:t>[ ] Campos pasan a una columna sin perder label, ayuda, error o contexto.</w:t>
+      </w:r>
+    </w:p>
+    <w:p>
+      <w:pPr>
+        <w:pStyle w:val="ListBullet"/>
+      </w:pPr>
+      <w:r>
+        <w:t>[ ] Lookups, calendarios, selects y textareas no desbordan.</w:t>
+      </w:r>
+    </w:p>
+    <w:p>
+      <w:pPr>
+        <w:pStyle w:val="ListBullet"/>
+      </w:pPr>
+      <w:r>
+        <w:t>[ ] Acciones primaria, secundaria y destructiva conservan orden y significado al apilarse.</w:t>
+      </w:r>
+    </w:p>
+    <w:p>
+      <w:pPr>
+        <w:pStyle w:val="ListBullet"/>
+      </w:pPr>
+      <w:r>
+        <w:t>[ ] Modal/drawer permite alcanzar encabezado, cierre, errores y acciones con teclado y tacto.</w:t>
+      </w:r>
+    </w:p>
+    <w:p>
+      <w:pPr>
+        <w:pStyle w:val="ListBullet"/>
+      </w:pPr>
+      <w:r>
+        <w:t>[ ] Targets tactiles tienen al menos 44 x 44 CSS px o superficie equivalente.</w:t>
+      </w:r>
+    </w:p>
+    <w:p>
+      <w:pPr>
+        <w:pStyle w:val="Heading2"/>
+      </w:pPr>
+      <w:r>
+        <w:t>QA-RESP-06 - Flujos, filtros y alertas</w:t>
+      </w:r>
+    </w:p>
+    <w:p>
+      <w:pPr>
+        <w:pStyle w:val="ListBullet"/>
+      </w:pPr>
+      <w:r>
+        <w:t>[ ] En escritorio e intermedio la guia descriptiva conserva el riel vertical izquierdo y su compresion; no cambia globalmente a barra horizontal.</w:t>
+      </w:r>
+    </w:p>
+    <w:p>
+      <w:pPr>
+        <w:pStyle w:val="ListBullet"/>
+      </w:pPr>
+      <w:r>
+        <w:t>[ ] Una excepcion responsive de un modulo no altera el formato de la guia ni otros componentes compartidos en las demas secciones.</w:t>
+      </w:r>
+    </w:p>
+    <w:p>
+      <w:pPr>
+        <w:pStyle w:val="ListBullet"/>
+      </w:pPr>
+      <w:r>
+        <w:t>[ ] La guia abierta, cerrada y en transicion no cubre contenido ni deja un control ambiguo.</w:t>
+      </w:r>
+    </w:p>
+    <w:p>
+      <w:pPr>
+        <w:pStyle w:val="ListBullet"/>
+      </w:pPr>
+      <w:r>
+        <w:t>[ ] Filtros hacen wrap; filtros secundarios y chips no expulsan acciones del panel.</w:t>
+      </w:r>
+    </w:p>
+    <w:p>
+      <w:pPr>
+        <w:pStyle w:val="ListBullet"/>
+      </w:pPr>
+      <w:r>
+        <w:t>[ ] Alertas y banners conservan titulo, mensaje, accion y cierre sin tapar la operacion.</w:t>
+      </w:r>
+    </w:p>
+    <w:p>
+      <w:pPr>
+        <w:pStyle w:val="ListBullet"/>
+      </w:pPr>
+      <w:r>
+        <w:t>[ ] El foco es visible y no queda detras de contenido sticky, modal o panel lateral.</w:t>
+      </w:r>
+    </w:p>
+    <w:p>
+      <w:pPr>
+        <w:pStyle w:val="Heading2"/>
+      </w:pPr>
+      <w:r>
+        <w:t>Evidencia</w:t>
+      </w:r>
+    </w:p>
+    <w:p>
+      <w:r>
+        <w:t>Adjuntar capturas de al menos un estado amplio, uno intermedio y uno estrecho, indicando viewport, ancho aproximado del panel, zoom, idioma, navegador y paneles laterales activos. Registrar como P1 cualquier bloqueo operativo, contenido esencial inaccesible o accion fuera de pantalla; defectos cosmeticos con alternativa pueden clasificarse P2.</w:t>
+      </w:r>
+    </w:p>
     <w:sectPr>
       <w:headerReference w:type="default" r:id="rId9"/>
       <w:footerReference w:type="default" r:id="rId10"/>

</xml_diff>